<commit_message>
Module Five Testing API
</commit_message>
<xml_diff>
--- a/Screenshots.docx
+++ b/Screenshots.docx
@@ -4,14 +4,291 @@
   <w:body>
     <w:p>
       <w:r>
+        <w:t>Christopher Kon</w:t>
+      </w:r>
+    </w:p>
+    <w:p>
+      <w:r>
+        <w:t>CS 465</w:t>
+      </w:r>
+    </w:p>
+    <w:p>
+      <w:r>
+        <w:t>Professor Chipman</w:t>
+      </w:r>
+    </w:p>
+    <w:p>
+      <w:r>
+        <w:t>Module 5</w:t>
+      </w:r>
+    </w:p>
+    <w:p/>
+    <w:p>
+      <w:pPr>
+        <w:ind w:firstLine="720"/>
+      </w:pPr>
+      <w:r>
+        <w:t xml:space="preserve">For this assignment, I refactored the </w:t>
+      </w:r>
+      <w:proofErr w:type="spellStart"/>
+      <w:r>
+        <w:t>Travlr</w:t>
+      </w:r>
+      <w:proofErr w:type="spellEnd"/>
+      <w:r>
+        <w:t xml:space="preserve"> Getaways application to separate the RESTful API endpoints from the main Express website using the Separation of Concerns design principle. This approach organizes the application into logical layers, reducing complexity and making future updates </w:t>
+      </w:r>
+      <w:r>
+        <w:t>more straightforward</w:t>
+      </w:r>
+      <w:r>
+        <w:t xml:space="preserve"> to manage. I created a new folder called </w:t>
+      </w:r>
+      <w:proofErr w:type="spellStart"/>
+      <w:r>
+        <w:t>app_api</w:t>
+      </w:r>
+      <w:proofErr w:type="spellEnd"/>
+      <w:r>
+        <w:t xml:space="preserve"> to </w:t>
+      </w:r>
+      <w:proofErr w:type="gramStart"/>
+      <w:r>
+        <w:t>contain</w:t>
+      </w:r>
+      <w:proofErr w:type="gramEnd"/>
+      <w:r>
+        <w:t xml:space="preserve"> the routes and controller logic for the API. The API connects to a MongoDB database using Mongoose, while the Express server runs on port 3000 to handle incoming requests.</w:t>
+      </w:r>
+    </w:p>
+    <w:p>
+      <w:pPr>
+        <w:ind w:firstLine="720"/>
+      </w:pPr>
+      <w:r>
+        <w:t xml:space="preserve">In this refactor, I </w:t>
+      </w:r>
+      <w:proofErr w:type="gramStart"/>
+      <w:r>
+        <w:t>established</w:t>
+      </w:r>
+      <w:proofErr w:type="gramEnd"/>
+      <w:r>
+        <w:t xml:space="preserve"> two </w:t>
+      </w:r>
+      <w:r>
+        <w:t>primary</w:t>
+      </w:r>
+      <w:r>
+        <w:t xml:space="preserve"> REST API endpoints: GET /</w:t>
+      </w:r>
+      <w:proofErr w:type="spellStart"/>
+      <w:r>
+        <w:t>api</w:t>
+      </w:r>
+      <w:proofErr w:type="spellEnd"/>
+      <w:r>
+        <w:t>/trips and GET /</w:t>
+      </w:r>
+      <w:proofErr w:type="spellStart"/>
+      <w:r>
+        <w:t>api</w:t>
+      </w:r>
+      <w:proofErr w:type="spellEnd"/>
+      <w:r>
+        <w:t>/trips</w:t>
+      </w:r>
+      <w:proofErr w:type="gramStart"/>
+      <w:r>
+        <w:t>/:</w:t>
+      </w:r>
+      <w:proofErr w:type="spellStart"/>
+      <w:r>
+        <w:t>tripCode</w:t>
+      </w:r>
+      <w:proofErr w:type="spellEnd"/>
+      <w:proofErr w:type="gramEnd"/>
+      <w:r>
+        <w:t xml:space="preserve">. The first route returns a JSON array of all trips from the database, and the second returns the details for a specific </w:t>
+      </w:r>
+      <w:r>
+        <w:t>journey</w:t>
+      </w:r>
+      <w:r>
+        <w:t xml:space="preserve"> based on its trip code. These routes follow standardized naming conventions and connect to controller functions </w:t>
+      </w:r>
+      <w:proofErr w:type="gramStart"/>
+      <w:r>
+        <w:t>located</w:t>
+      </w:r>
+      <w:proofErr w:type="gramEnd"/>
+      <w:r>
+        <w:t xml:space="preserve"> in </w:t>
+      </w:r>
+      <w:proofErr w:type="spellStart"/>
+      <w:r>
+        <w:t>app_api</w:t>
+      </w:r>
+      <w:proofErr w:type="spellEnd"/>
+      <w:r>
+        <w:t>/controllers/trips.js. The Model-View-Controller (</w:t>
+      </w:r>
+      <w:proofErr w:type="spellStart"/>
+      <w:r>
+        <w:t>MVC</w:t>
+      </w:r>
+      <w:proofErr w:type="spellEnd"/>
+      <w:r>
+        <w:t xml:space="preserve">) pattern </w:t>
+      </w:r>
+      <w:proofErr w:type="gramStart"/>
+      <w:r>
+        <w:t>is fully implemented</w:t>
+      </w:r>
+      <w:proofErr w:type="gramEnd"/>
+      <w:r>
+        <w:t xml:space="preserve">, with the Trip model defined in models/trip.js using Mongoose, the controller functions </w:t>
+      </w:r>
+      <w:r>
+        <w:t>described</w:t>
+      </w:r>
+      <w:r>
+        <w:t xml:space="preserve"> in controllers/trips.js, and the routes declared in routes/index.js. I also added a /health route to verify that the API is running </w:t>
+      </w:r>
+      <w:r>
+        <w:t>correctly</w:t>
+      </w:r>
+      <w:r>
+        <w:t>.</w:t>
+      </w:r>
+    </w:p>
+    <w:p>
+      <w:pPr>
+        <w:ind w:firstLine="720"/>
+      </w:pPr>
+      <w:r>
+        <w:t>To confirm functionality, I tested all routes using Postman and curl. The GET /</w:t>
+      </w:r>
+      <w:proofErr w:type="spellStart"/>
+      <w:r>
+        <w:t>api</w:t>
+      </w:r>
+      <w:proofErr w:type="spellEnd"/>
+      <w:r>
+        <w:t xml:space="preserve">/trips route </w:t>
+      </w:r>
+      <w:proofErr w:type="gramStart"/>
+      <w:r>
+        <w:t>returned</w:t>
+      </w:r>
+      <w:proofErr w:type="gramEnd"/>
+      <w:r>
+        <w:t xml:space="preserve"> a 200 OK status with a JSON array of </w:t>
+      </w:r>
+      <w:proofErr w:type="gramStart"/>
+      <w:r>
+        <w:t>trips, and</w:t>
+      </w:r>
+      <w:proofErr w:type="gramEnd"/>
+      <w:r>
+        <w:t xml:space="preserve"> GET /</w:t>
+      </w:r>
+      <w:proofErr w:type="spellStart"/>
+      <w:r>
+        <w:t>api</w:t>
+      </w:r>
+      <w:proofErr w:type="spellEnd"/>
+      <w:r>
+        <w:t>/trips/CANCUN5 returned a 200 OK response with the trip’s details. When testing an invalid code such as GET /</w:t>
+      </w:r>
+      <w:proofErr w:type="spellStart"/>
+      <w:r>
+        <w:t>api</w:t>
+      </w:r>
+      <w:proofErr w:type="spellEnd"/>
+      <w:r>
+        <w:t>/trips/</w:t>
+      </w:r>
+      <w:proofErr w:type="spellStart"/>
+      <w:r>
+        <w:t>FAKECODE</w:t>
+      </w:r>
+      <w:proofErr w:type="spellEnd"/>
+      <w:r>
+        <w:t xml:space="preserve">, the system correctly responded with a 404 Not Found status and the message “Trip with code </w:t>
+      </w:r>
+      <w:proofErr w:type="spellStart"/>
+      <w:r>
+        <w:t>FAKECODE</w:t>
+      </w:r>
+      <w:proofErr w:type="spellEnd"/>
+      <w:r>
+        <w:t xml:space="preserve"> not found.” I also verified that if MongoDB is offline, the API returns a 500 Internal Server Error message. Additionally, the /health route responded with </w:t>
+      </w:r>
+      <w:r>
+        <w:t xml:space="preserve">a 200 OK status code and a response body containing </w:t>
+      </w:r>
+      <w:proofErr w:type="gramStart"/>
+      <w:r>
+        <w:t>{ "</w:t>
+      </w:r>
+      <w:proofErr w:type="gramEnd"/>
+      <w:r>
+        <w:t xml:space="preserve">ok": </w:t>
+      </w:r>
+      <w:proofErr w:type="gramStart"/>
+      <w:r>
+        <w:t>true }</w:t>
+      </w:r>
+      <w:proofErr w:type="gramEnd"/>
+      <w:r>
+        <w:t>, confirming that the API is online.</w:t>
+      </w:r>
+    </w:p>
+    <w:p>
+      <w:pPr>
+        <w:ind w:firstLine="720"/>
+      </w:pPr>
+      <w:r>
+        <w:t xml:space="preserve">Overall, the </w:t>
+      </w:r>
+      <w:proofErr w:type="spellStart"/>
+      <w:r>
+        <w:t>Travlr</w:t>
+      </w:r>
+      <w:proofErr w:type="spellEnd"/>
+      <w:r>
+        <w:t xml:space="preserve"> Getaways API meets all assignment requirements by successfully separating the database and API from the front end, implementing the </w:t>
+      </w:r>
+      <w:proofErr w:type="spellStart"/>
+      <w:r>
+        <w:t>MVC</w:t>
+      </w:r>
+      <w:proofErr w:type="spellEnd"/>
+      <w:r>
+        <w:t xml:space="preserve"> structure, and verifying data retrieval using the Mongoose FIND and </w:t>
+      </w:r>
+      <w:proofErr w:type="spellStart"/>
+      <w:r>
+        <w:t>FINDONE</w:t>
+      </w:r>
+      <w:proofErr w:type="spellEnd"/>
+      <w:r>
+        <w:t xml:space="preserve"> methods. The API correctly handles both valid and invalid requests, returns well-structured JSON responses, and uses proper HTTP status codes for all scenarios.</w:t>
+      </w:r>
+    </w:p>
+    <w:p/>
+    <w:p>
+      <w:r>
         <w:rPr>
           <w:noProof/>
         </w:rPr>
+        <w:lastRenderedPageBreak/>
         <w:drawing>
-          <wp:inline distT="0" distB="0" distL="0" distR="0" wp14:anchorId="18431555" wp14:editId="6C947756">
-            <wp:extent cx="5943600" cy="3173095"/>
-            <wp:effectExtent l="0" t="0" r="0" b="8255"/>
-            <wp:docPr id="1977975003" name="Picture 1" descr="A person in a garment on a beach&#10;&#10;AI-generated content may be incorrect."/>
+          <wp:inline distT="0" distB="0" distL="0" distR="0" wp14:anchorId="215E7C69" wp14:editId="41E761A3">
+            <wp:extent cx="4676775" cy="2095500"/>
+            <wp:effectExtent l="0" t="0" r="9525" b="0"/>
+            <wp:docPr id="529795299" name="Picture 1" descr="A screenshot of a computer&#10;&#10;AI-generated content may be incorrect."/>
             <wp:cNvGraphicFramePr>
               <a:graphicFrameLocks xmlns:a="http://schemas.openxmlformats.org/drawingml/2006/main" noChangeAspect="1"/>
             </wp:cNvGraphicFramePr>
@@ -19,7 +296,7 @@
               <a:graphicData uri="http://schemas.openxmlformats.org/drawingml/2006/picture">
                 <pic:pic xmlns:pic="http://schemas.openxmlformats.org/drawingml/2006/picture">
                   <pic:nvPicPr>
-                    <pic:cNvPr id="1977975003" name="Picture 1" descr="A person in a garment on a beach&#10;&#10;AI-generated content may be incorrect."/>
+                    <pic:cNvPr id="529795299" name="Picture 1" descr="A screenshot of a computer&#10;&#10;AI-generated content may be incorrect."/>
                     <pic:cNvPicPr/>
                   </pic:nvPicPr>
                   <pic:blipFill>
@@ -31,7 +308,7 @@
                   <pic:spPr>
                     <a:xfrm>
                       <a:off x="0" y="0"/>
-                      <a:ext cx="5943600" cy="3173095"/>
+                      <a:ext cx="4676775" cy="2095500"/>
                     </a:xfrm>
                     <a:prstGeom prst="rect">
                       <a:avLst/>
@@ -48,10 +325,10 @@
           <w:noProof/>
         </w:rPr>
         <w:drawing>
-          <wp:inline distT="0" distB="0" distL="0" distR="0" wp14:anchorId="3F6C31C7" wp14:editId="424F43CE">
-            <wp:extent cx="5943600" cy="3249930"/>
-            <wp:effectExtent l="0" t="0" r="0" b="7620"/>
-            <wp:docPr id="185950022" name="Picture 1" descr="A screenshot of a computer program&#10;&#10;AI-generated content may be incorrect."/>
+          <wp:inline distT="0" distB="0" distL="0" distR="0" wp14:anchorId="58B3ACF6" wp14:editId="775A1497">
+            <wp:extent cx="4143375" cy="1466850"/>
+            <wp:effectExtent l="0" t="0" r="9525" b="0"/>
+            <wp:docPr id="777622569" name="Picture 1" descr="A screenshot of a computer&#10;&#10;AI-generated content may be incorrect."/>
             <wp:cNvGraphicFramePr>
               <a:graphicFrameLocks xmlns:a="http://schemas.openxmlformats.org/drawingml/2006/main" noChangeAspect="1"/>
             </wp:cNvGraphicFramePr>
@@ -59,7 +336,7 @@
               <a:graphicData uri="http://schemas.openxmlformats.org/drawingml/2006/picture">
                 <pic:pic xmlns:pic="http://schemas.openxmlformats.org/drawingml/2006/picture">
                   <pic:nvPicPr>
-                    <pic:cNvPr id="185950022" name="Picture 1" descr="A screenshot of a computer program&#10;&#10;AI-generated content may be incorrect."/>
+                    <pic:cNvPr id="777622569" name="Picture 1" descr="A screenshot of a computer&#10;&#10;AI-generated content may be incorrect."/>
                     <pic:cNvPicPr/>
                   </pic:nvPicPr>
                   <pic:blipFill>
@@ -71,7 +348,177 @@
                   <pic:spPr>
                     <a:xfrm>
                       <a:off x="0" y="0"/>
-                      <a:ext cx="5943600" cy="3249930"/>
+                      <a:ext cx="4143375" cy="1466850"/>
+                    </a:xfrm>
+                    <a:prstGeom prst="rect">
+                      <a:avLst/>
+                    </a:prstGeom>
+                  </pic:spPr>
+                </pic:pic>
+              </a:graphicData>
+            </a:graphic>
+          </wp:inline>
+        </w:drawing>
+      </w:r>
+    </w:p>
+    <w:p/>
+    <w:p>
+      <w:r>
+        <w:rPr>
+          <w:noProof/>
+        </w:rPr>
+        <w:drawing>
+          <wp:inline distT="0" distB="0" distL="0" distR="0" wp14:anchorId="1EF7D00E" wp14:editId="13F4D69E">
+            <wp:extent cx="4572000" cy="1971675"/>
+            <wp:effectExtent l="0" t="0" r="0" b="9525"/>
+            <wp:docPr id="367115481" name="Picture 1" descr="A screenshot of a computer screen&#10;&#10;AI-generated content may be incorrect."/>
+            <wp:cNvGraphicFramePr>
+              <a:graphicFrameLocks xmlns:a="http://schemas.openxmlformats.org/drawingml/2006/main" noChangeAspect="1"/>
+            </wp:cNvGraphicFramePr>
+            <a:graphic xmlns:a="http://schemas.openxmlformats.org/drawingml/2006/main">
+              <a:graphicData uri="http://schemas.openxmlformats.org/drawingml/2006/picture">
+                <pic:pic xmlns:pic="http://schemas.openxmlformats.org/drawingml/2006/picture">
+                  <pic:nvPicPr>
+                    <pic:cNvPr id="367115481" name="Picture 1" descr="A screenshot of a computer screen&#10;&#10;AI-generated content may be incorrect."/>
+                    <pic:cNvPicPr/>
+                  </pic:nvPicPr>
+                  <pic:blipFill>
+                    <a:blip r:embed="rId6"/>
+                    <a:stretch>
+                      <a:fillRect/>
+                    </a:stretch>
+                  </pic:blipFill>
+                  <pic:spPr>
+                    <a:xfrm>
+                      <a:off x="0" y="0"/>
+                      <a:ext cx="4572000" cy="1971675"/>
+                    </a:xfrm>
+                    <a:prstGeom prst="rect">
+                      <a:avLst/>
+                    </a:prstGeom>
+                  </pic:spPr>
+                </pic:pic>
+              </a:graphicData>
+            </a:graphic>
+          </wp:inline>
+        </w:drawing>
+      </w:r>
+    </w:p>
+    <w:p>
+      <w:r>
+        <w:rPr>
+          <w:noProof/>
+        </w:rPr>
+        <w:drawing>
+          <wp:inline distT="0" distB="0" distL="0" distR="0" wp14:anchorId="0E3C8F8E" wp14:editId="1D1FBB81">
+            <wp:extent cx="6567728" cy="530470"/>
+            <wp:effectExtent l="0" t="0" r="5080" b="3175"/>
+            <wp:docPr id="139733973" name="Picture 1"/>
+            <wp:cNvGraphicFramePr>
+              <a:graphicFrameLocks xmlns:a="http://schemas.openxmlformats.org/drawingml/2006/main" noChangeAspect="1"/>
+            </wp:cNvGraphicFramePr>
+            <a:graphic xmlns:a="http://schemas.openxmlformats.org/drawingml/2006/main">
+              <a:graphicData uri="http://schemas.openxmlformats.org/drawingml/2006/picture">
+                <pic:pic xmlns:pic="http://schemas.openxmlformats.org/drawingml/2006/picture">
+                  <pic:nvPicPr>
+                    <pic:cNvPr id="139733973" name=""/>
+                    <pic:cNvPicPr/>
+                  </pic:nvPicPr>
+                  <pic:blipFill>
+                    <a:blip r:embed="rId7"/>
+                    <a:stretch>
+                      <a:fillRect/>
+                    </a:stretch>
+                  </pic:blipFill>
+                  <pic:spPr>
+                    <a:xfrm>
+                      <a:off x="0" y="0"/>
+                      <a:ext cx="6676409" cy="539248"/>
+                    </a:xfrm>
+                    <a:prstGeom prst="rect">
+                      <a:avLst/>
+                    </a:prstGeom>
+                  </pic:spPr>
+                </pic:pic>
+              </a:graphicData>
+            </a:graphic>
+          </wp:inline>
+        </w:drawing>
+      </w:r>
+    </w:p>
+    <w:p>
+      <w:r>
+        <w:rPr>
+          <w:noProof/>
+        </w:rPr>
+        <w:lastRenderedPageBreak/>
+        <w:drawing>
+          <wp:inline distT="0" distB="0" distL="0" distR="0" wp14:anchorId="2EB0D2EE" wp14:editId="06E15513">
+            <wp:extent cx="5943600" cy="1798320"/>
+            <wp:effectExtent l="0" t="0" r="0" b="0"/>
+            <wp:docPr id="627213205" name="Picture 1" descr="A screen shot of a computer&#10;&#10;AI-generated content may be incorrect."/>
+            <wp:cNvGraphicFramePr>
+              <a:graphicFrameLocks xmlns:a="http://schemas.openxmlformats.org/drawingml/2006/main" noChangeAspect="1"/>
+            </wp:cNvGraphicFramePr>
+            <a:graphic xmlns:a="http://schemas.openxmlformats.org/drawingml/2006/main">
+              <a:graphicData uri="http://schemas.openxmlformats.org/drawingml/2006/picture">
+                <pic:pic xmlns:pic="http://schemas.openxmlformats.org/drawingml/2006/picture">
+                  <pic:nvPicPr>
+                    <pic:cNvPr id="627213205" name="Picture 1" descr="A screen shot of a computer&#10;&#10;AI-generated content may be incorrect."/>
+                    <pic:cNvPicPr/>
+                  </pic:nvPicPr>
+                  <pic:blipFill>
+                    <a:blip r:embed="rId8"/>
+                    <a:stretch>
+                      <a:fillRect/>
+                    </a:stretch>
+                  </pic:blipFill>
+                  <pic:spPr>
+                    <a:xfrm>
+                      <a:off x="0" y="0"/>
+                      <a:ext cx="5943600" cy="1798320"/>
+                    </a:xfrm>
+                    <a:prstGeom prst="rect">
+                      <a:avLst/>
+                    </a:prstGeom>
+                  </pic:spPr>
+                </pic:pic>
+              </a:graphicData>
+            </a:graphic>
+          </wp:inline>
+        </w:drawing>
+      </w:r>
+    </w:p>
+    <w:p>
+      <w:r>
+        <w:rPr>
+          <w:noProof/>
+        </w:rPr>
+        <w:drawing>
+          <wp:inline distT="0" distB="0" distL="0" distR="0" wp14:anchorId="60C0CA21" wp14:editId="7C66E7AB">
+            <wp:extent cx="4667250" cy="1847850"/>
+            <wp:effectExtent l="0" t="0" r="0" b="0"/>
+            <wp:docPr id="330779184" name="Picture 1" descr="A computer screen shot of a computer code&#10;&#10;AI-generated content may be incorrect."/>
+            <wp:cNvGraphicFramePr>
+              <a:graphicFrameLocks xmlns:a="http://schemas.openxmlformats.org/drawingml/2006/main" noChangeAspect="1"/>
+            </wp:cNvGraphicFramePr>
+            <a:graphic xmlns:a="http://schemas.openxmlformats.org/drawingml/2006/main">
+              <a:graphicData uri="http://schemas.openxmlformats.org/drawingml/2006/picture">
+                <pic:pic xmlns:pic="http://schemas.openxmlformats.org/drawingml/2006/picture">
+                  <pic:nvPicPr>
+                    <pic:cNvPr id="330779184" name="Picture 1" descr="A computer screen shot of a computer code&#10;&#10;AI-generated content may be incorrect."/>
+                    <pic:cNvPicPr/>
+                  </pic:nvPicPr>
+                  <pic:blipFill>
+                    <a:blip r:embed="rId9"/>
+                    <a:stretch>
+                      <a:fillRect/>
+                    </a:stretch>
+                  </pic:blipFill>
+                  <pic:spPr>
+                    <a:xfrm>
+                      <a:off x="0" y="0"/>
+                      <a:ext cx="4667250" cy="1847850"/>
                     </a:xfrm>
                     <a:prstGeom prst="rect">
                       <a:avLst/>
@@ -502,7 +949,7 @@
     <w:link w:val="Heading1Char"/>
     <w:uiPriority w:val="9"/>
     <w:qFormat/>
-    <w:rsid w:val="00CB52C6"/>
+    <w:rsid w:val="00193BB2"/>
     <w:pPr>
       <w:keepNext/>
       <w:keepLines/>
@@ -525,7 +972,7 @@
     <w:semiHidden/>
     <w:unhideWhenUsed/>
     <w:qFormat/>
-    <w:rsid w:val="00CB52C6"/>
+    <w:rsid w:val="00193BB2"/>
     <w:pPr>
       <w:keepNext/>
       <w:keepLines/>
@@ -548,7 +995,7 @@
     <w:semiHidden/>
     <w:unhideWhenUsed/>
     <w:qFormat/>
-    <w:rsid w:val="00CB52C6"/>
+    <w:rsid w:val="00193BB2"/>
     <w:pPr>
       <w:keepNext/>
       <w:keepLines/>
@@ -571,7 +1018,7 @@
     <w:semiHidden/>
     <w:unhideWhenUsed/>
     <w:qFormat/>
-    <w:rsid w:val="00CB52C6"/>
+    <w:rsid w:val="00193BB2"/>
     <w:pPr>
       <w:keepNext/>
       <w:keepLines/>
@@ -594,7 +1041,7 @@
     <w:semiHidden/>
     <w:unhideWhenUsed/>
     <w:qFormat/>
-    <w:rsid w:val="00CB52C6"/>
+    <w:rsid w:val="00193BB2"/>
     <w:pPr>
       <w:keepNext/>
       <w:keepLines/>
@@ -615,7 +1062,7 @@
     <w:semiHidden/>
     <w:unhideWhenUsed/>
     <w:qFormat/>
-    <w:rsid w:val="00CB52C6"/>
+    <w:rsid w:val="00193BB2"/>
     <w:pPr>
       <w:keepNext/>
       <w:keepLines/>
@@ -638,7 +1085,7 @@
     <w:semiHidden/>
     <w:unhideWhenUsed/>
     <w:qFormat/>
-    <w:rsid w:val="00CB52C6"/>
+    <w:rsid w:val="00193BB2"/>
     <w:pPr>
       <w:keepNext/>
       <w:keepLines/>
@@ -659,7 +1106,7 @@
     <w:semiHidden/>
     <w:unhideWhenUsed/>
     <w:qFormat/>
-    <w:rsid w:val="00CB52C6"/>
+    <w:rsid w:val="00193BB2"/>
     <w:pPr>
       <w:keepNext/>
       <w:keepLines/>
@@ -682,7 +1129,7 @@
     <w:semiHidden/>
     <w:unhideWhenUsed/>
     <w:qFormat/>
-    <w:rsid w:val="00CB52C6"/>
+    <w:rsid w:val="00193BB2"/>
     <w:pPr>
       <w:keepNext/>
       <w:keepLines/>
@@ -726,7 +1173,7 @@
     <w:basedOn w:val="DefaultParagraphFont"/>
     <w:link w:val="Heading1"/>
     <w:uiPriority w:val="9"/>
-    <w:rsid w:val="00CB52C6"/>
+    <w:rsid w:val="00193BB2"/>
     <w:rPr>
       <w:rFonts w:asciiTheme="majorHAnsi" w:eastAsiaTheme="majorEastAsia" w:hAnsiTheme="majorHAnsi" w:cstheme="majorBidi"/>
       <w:color w:val="2F5496" w:themeColor="accent1" w:themeShade="BF"/>
@@ -740,7 +1187,7 @@
     <w:link w:val="Heading2"/>
     <w:uiPriority w:val="9"/>
     <w:semiHidden/>
-    <w:rsid w:val="00CB52C6"/>
+    <w:rsid w:val="00193BB2"/>
     <w:rPr>
       <w:rFonts w:asciiTheme="majorHAnsi" w:eastAsiaTheme="majorEastAsia" w:hAnsiTheme="majorHAnsi" w:cstheme="majorBidi"/>
       <w:color w:val="2F5496" w:themeColor="accent1" w:themeShade="BF"/>
@@ -754,7 +1201,7 @@
     <w:link w:val="Heading3"/>
     <w:uiPriority w:val="9"/>
     <w:semiHidden/>
-    <w:rsid w:val="00CB52C6"/>
+    <w:rsid w:val="00193BB2"/>
     <w:rPr>
       <w:rFonts w:eastAsiaTheme="majorEastAsia" w:cstheme="majorBidi"/>
       <w:color w:val="2F5496" w:themeColor="accent1" w:themeShade="BF"/>
@@ -768,7 +1215,7 @@
     <w:link w:val="Heading4"/>
     <w:uiPriority w:val="9"/>
     <w:semiHidden/>
-    <w:rsid w:val="00CB52C6"/>
+    <w:rsid w:val="00193BB2"/>
     <w:rPr>
       <w:rFonts w:eastAsiaTheme="majorEastAsia" w:cstheme="majorBidi"/>
       <w:i/>
@@ -782,7 +1229,7 @@
     <w:link w:val="Heading5"/>
     <w:uiPriority w:val="9"/>
     <w:semiHidden/>
-    <w:rsid w:val="00CB52C6"/>
+    <w:rsid w:val="00193BB2"/>
     <w:rPr>
       <w:rFonts w:eastAsiaTheme="majorEastAsia" w:cstheme="majorBidi"/>
       <w:color w:val="2F5496" w:themeColor="accent1" w:themeShade="BF"/>
@@ -794,7 +1241,7 @@
     <w:link w:val="Heading6"/>
     <w:uiPriority w:val="9"/>
     <w:semiHidden/>
-    <w:rsid w:val="00CB52C6"/>
+    <w:rsid w:val="00193BB2"/>
     <w:rPr>
       <w:rFonts w:eastAsiaTheme="majorEastAsia" w:cstheme="majorBidi"/>
       <w:i/>
@@ -808,7 +1255,7 @@
     <w:link w:val="Heading7"/>
     <w:uiPriority w:val="9"/>
     <w:semiHidden/>
-    <w:rsid w:val="00CB52C6"/>
+    <w:rsid w:val="00193BB2"/>
     <w:rPr>
       <w:rFonts w:eastAsiaTheme="majorEastAsia" w:cstheme="majorBidi"/>
       <w:color w:val="595959" w:themeColor="text1" w:themeTint="A6"/>
@@ -820,7 +1267,7 @@
     <w:link w:val="Heading8"/>
     <w:uiPriority w:val="9"/>
     <w:semiHidden/>
-    <w:rsid w:val="00CB52C6"/>
+    <w:rsid w:val="00193BB2"/>
     <w:rPr>
       <w:rFonts w:eastAsiaTheme="majorEastAsia" w:cstheme="majorBidi"/>
       <w:i/>
@@ -834,7 +1281,7 @@
     <w:link w:val="Heading9"/>
     <w:uiPriority w:val="9"/>
     <w:semiHidden/>
-    <w:rsid w:val="00CB52C6"/>
+    <w:rsid w:val="00193BB2"/>
     <w:rPr>
       <w:rFonts w:eastAsiaTheme="majorEastAsia" w:cstheme="majorBidi"/>
       <w:color w:val="272727" w:themeColor="text1" w:themeTint="D8"/>
@@ -847,7 +1294,7 @@
     <w:link w:val="TitleChar"/>
     <w:uiPriority w:val="10"/>
     <w:qFormat/>
-    <w:rsid w:val="00CB52C6"/>
+    <w:rsid w:val="00193BB2"/>
     <w:pPr>
       <w:spacing w:after="80" w:line="240" w:lineRule="auto"/>
       <w:contextualSpacing/>
@@ -865,7 +1312,7 @@
     <w:basedOn w:val="DefaultParagraphFont"/>
     <w:link w:val="Title"/>
     <w:uiPriority w:val="10"/>
-    <w:rsid w:val="00CB52C6"/>
+    <w:rsid w:val="00193BB2"/>
     <w:rPr>
       <w:rFonts w:asciiTheme="majorHAnsi" w:eastAsiaTheme="majorEastAsia" w:hAnsiTheme="majorHAnsi" w:cstheme="majorBidi"/>
       <w:spacing w:val="-10"/>
@@ -881,7 +1328,7 @@
     <w:link w:val="SubtitleChar"/>
     <w:uiPriority w:val="11"/>
     <w:qFormat/>
-    <w:rsid w:val="00CB52C6"/>
+    <w:rsid w:val="00193BB2"/>
     <w:pPr>
       <w:numPr>
         <w:ilvl w:val="1"/>
@@ -900,7 +1347,7 @@
     <w:basedOn w:val="DefaultParagraphFont"/>
     <w:link w:val="Subtitle"/>
     <w:uiPriority w:val="11"/>
-    <w:rsid w:val="00CB52C6"/>
+    <w:rsid w:val="00193BB2"/>
     <w:rPr>
       <w:rFonts w:eastAsiaTheme="majorEastAsia" w:cstheme="majorBidi"/>
       <w:color w:val="595959" w:themeColor="text1" w:themeTint="A6"/>
@@ -916,7 +1363,7 @@
     <w:link w:val="QuoteChar"/>
     <w:uiPriority w:val="29"/>
     <w:qFormat/>
-    <w:rsid w:val="00CB52C6"/>
+    <w:rsid w:val="00193BB2"/>
     <w:pPr>
       <w:spacing w:before="160"/>
       <w:jc w:val="center"/>
@@ -932,7 +1379,7 @@
     <w:basedOn w:val="DefaultParagraphFont"/>
     <w:link w:val="Quote"/>
     <w:uiPriority w:val="29"/>
-    <w:rsid w:val="00CB52C6"/>
+    <w:rsid w:val="00193BB2"/>
     <w:rPr>
       <w:i/>
       <w:iCs/>
@@ -944,7 +1391,7 @@
     <w:basedOn w:val="Normal"/>
     <w:uiPriority w:val="34"/>
     <w:qFormat/>
-    <w:rsid w:val="00CB52C6"/>
+    <w:rsid w:val="00193BB2"/>
     <w:pPr>
       <w:ind w:left="720"/>
       <w:contextualSpacing/>
@@ -955,7 +1402,7 @@
     <w:basedOn w:val="DefaultParagraphFont"/>
     <w:uiPriority w:val="21"/>
     <w:qFormat/>
-    <w:rsid w:val="00CB52C6"/>
+    <w:rsid w:val="00193BB2"/>
     <w:rPr>
       <w:i/>
       <w:iCs/>
@@ -969,7 +1416,7 @@
     <w:link w:val="IntenseQuoteChar"/>
     <w:uiPriority w:val="30"/>
     <w:qFormat/>
-    <w:rsid w:val="00CB52C6"/>
+    <w:rsid w:val="00193BB2"/>
     <w:pPr>
       <w:pBdr>
         <w:top w:val="single" w:sz="4" w:space="10" w:color="2F5496" w:themeColor="accent1" w:themeShade="BF"/>
@@ -990,7 +1437,7 @@
     <w:basedOn w:val="DefaultParagraphFont"/>
     <w:link w:val="IntenseQuote"/>
     <w:uiPriority w:val="30"/>
-    <w:rsid w:val="00CB52C6"/>
+    <w:rsid w:val="00193BB2"/>
     <w:rPr>
       <w:i/>
       <w:iCs/>
@@ -1002,7 +1449,7 @@
     <w:basedOn w:val="DefaultParagraphFont"/>
     <w:uiPriority w:val="32"/>
     <w:qFormat/>
-    <w:rsid w:val="00CB52C6"/>
+    <w:rsid w:val="00193BB2"/>
     <w:rPr>
       <w:b/>
       <w:bCs/>

</xml_diff>